<commit_message>
Revert "Iki corresponding author; gonderilecek surum v8"
This reverts commit cea67feb07862c4958f7b7212942c60be692c27c.
</commit_message>
<xml_diff>
--- a/makale/pdf/meryemAircraft-MDPI.docx
+++ b/makale/pdf/meryemAircraft-MDPI.docx
@@ -77,7 +77,7 @@
           <w:sz w:val="20"/>
           <w:vertAlign w:val="superscript"/>
         </w:rPr>
-        <w:t>1,*</w:t>
+        <w:t>1</w:t>
       </w:r>
     </w:p>
     <w:p>
@@ -127,7 +127,7 @@
           <w:i w:val="0"/>
           <w:sz w:val="20"/>
         </w:rPr>
-        <w:t xml:space="preserve"> Correspondence: meryemgulmen@outlook.com (M.G.); lordtek@me.com (Ö.G.)</w:t>
+        <w:t xml:space="preserve"> Correspondence: meryemgulmen@outlook.com</w:t>
       </w:r>
     </w:p>
     <w:p>

</xml_diff>